<commit_message>
Update efficiency roadmap with step 1 results and labeler step
</commit_message>
<xml_diff>
--- a/docs/Hoja_de_Ruta_Eficiencia.docx
+++ b/docs/Hoja_de_Ruta_Eficiencia.docx
@@ -30,7 +30,7 @@
           <w:iCs/>
           <w:color w:val="595959"/>
         </w:rPr>
-        <w:t xml:space="preserve">Versión 1 · 26 de septiembre de 2026 · antes de resultados. Se actualiza al cerrar cada paso.</w:t>
+        <w:t xml:space="preserve">Versión 2 · 27 de septiembre de 2026 · con resultados del paso 1. Se actualiza al cerrar cada paso.</w:t>
       </w:r>
     </w:p>
     <w:p>
@@ -125,7 +125,7 @@
         <w:spacing w:after="60"/>
       </w:pPr>
       <w:r>
-        <w:t xml:space="preserve">Referencia exp002 (DINOv2-small, 224 px, 5 series × 16 cortes): gold ≈ 0.78 en fold 0; los 5 folds ya terminaron.</w:t>
+        <w:t xml:space="preserve">Referencia exp002 (DINOv2-small, 224 px, 5 series × 16 cortes): fold 0 pseudo 0.827 y gold 0.776; 5 folds OOF pseudo 0.801 y gold 0.788.</w:t>
       </w:r>
     </w:p>
     <w:p>
@@ -138,7 +138,7 @@
         <w:spacing w:after="60"/>
       </w:pPr>
       <w:r>
-        <w:t xml:space="preserve">Notebooks públicos: ≈ 0.94. La diferencia viene de la entrada (recorte, resolución, series), de la cabeza y de las etiquetas, no de afinar hiperparámetros.</w:t>
+        <w:t xml:space="preserve">Paso 1 cerrado: con esta receta ningún backbone supera a DINOv2-S. Detalle en la bitácora (sección 7).</w:t>
       </w:r>
     </w:p>
     <w:p>
@@ -151,16 +151,7 @@
         <w:spacing w:after="60"/>
       </w:pPr>
       <w:r>
-        <w:t xml:space="preserve">Casi ningún paper de resonancia de rodilla reporta costo de cómputo. Ahí está nuestro espacio.</w:t>
-      </w:r>
-    </w:p>
-    <w:p>
-      <w:pPr>
-        <w:pStyle w:val="Heading1"/>
-        <w:spacing w:after="120" w:before="280"/>
-      </w:pPr>
-      <w:r>
-        <w:t xml:space="preserve">3. Cómo se leen los pasos</w:t>
+        <w:t xml:space="preserve">Notebooks públicos: ≈ 0.94. La diferencia viene de la entrada (recorte, resolución, series), de la cabeza y de las etiquetas, no de afinar hiperparámetros.</w:t>
       </w:r>
     </w:p>
     <w:p>
@@ -173,17 +164,16 @@
         <w:spacing w:after="60"/>
       </w:pPr>
       <w:r>
-        <w:t xml:space="preserve">Un paso es una </w:t>
-      </w:r>
-      <w:r>
-        <w:rPr>
-          <w:b/>
-          <w:bCs/>
-        </w:rPr>
-        <w:t xml:space="preserve">pregunta</w:t>
-      </w:r>
-      <w:r>
-        <w:t xml:space="preserve">. Para responderla se entrenan varios modelos (cada uno es un experimento SDD con una sola variable).</w:t>
+        <w:t xml:space="preserve">Casi ningún paper de resonancia de rodilla reporta costo de cómputo. Ahí está nuestro espacio.</w:t>
+      </w:r>
+    </w:p>
+    <w:p>
+      <w:pPr>
+        <w:pStyle w:val="Heading1"/>
+        <w:spacing w:after="120" w:before="280"/>
+      </w:pPr>
+      <w:r>
+        <w:t xml:space="preserve">3. Cómo se leen los pasos</w:t>
       </w:r>
     </w:p>
     <w:p>
@@ -196,7 +186,17 @@
         <w:spacing w:after="60"/>
       </w:pPr>
       <w:r>
-        <w:t xml:space="preserve">El resultado de un paso puede ser "funciona" o "no funciona"; los dos cuentan. Lo que funciona pasa al siguiente paso.</w:t>
+        <w:t xml:space="preserve">Un paso es una </w:t>
+      </w:r>
+      <w:r>
+        <w:rPr>
+          <w:b/>
+          <w:bCs/>
+        </w:rPr>
+        <w:t xml:space="preserve">pregunta</w:t>
+      </w:r>
+      <w:r>
+        <w:t xml:space="preserve">. Para responderla se entrenan varios modelos (cada uno es un experimento SDD con una sola variable).</w:t>
       </w:r>
     </w:p>
     <w:p>
@@ -209,7 +209,7 @@
         <w:spacing w:after="60"/>
       </w:pPr>
       <w:r>
-        <w:t xml:space="preserve">Si un paso deja 3 ganadores, el siguiente paso se prueba sobre los 3.</w:t>
+        <w:t xml:space="preserve">El resultado de un paso puede ser "funciona" o "no funciona"; los dos cuentan. Lo que funciona pasa al siguiente paso.</w:t>
       </w:r>
     </w:p>
     <w:p>
@@ -222,7 +222,7 @@
         <w:spacing w:after="60"/>
       </w:pPr>
       <w:r>
-        <w:t xml:space="preserve">Las ideas son un punto de partida, no una receta. Si en el camino aparece algo mejor, se propone como experimento.</w:t>
+        <w:t xml:space="preserve">Si un paso deja 3 ganadores, el siguiente paso se prueba sobre los 3.</w:t>
       </w:r>
     </w:p>
     <w:p>
@@ -235,6 +235,19 @@
         <w:spacing w:after="60"/>
       </w:pPr>
       <w:r>
+        <w:t xml:space="preserve">Las ideas son un punto de partida, no una receta. Si en el camino aparece algo mejor, se propone como experimento.</w:t>
+      </w:r>
+    </w:p>
+    <w:p>
+      <w:pPr>
+        <w:pStyle w:val="ListParagraph"/>
+        <w:numPr>
+          <w:ilvl w:val="0"/>
+          <w:numId w:val="2"/>
+        </w:numPr>
+        <w:spacing w:after="60"/>
+      </w:pPr>
+      <w:r>
         <w:t xml:space="preserve">Screening en fold 0 contra el padre; lo prometedor se confirma con 5 folds. Gold nunca elige, solo veta.</w:t>
       </w:r>
     </w:p>
@@ -245,6 +258,14 @@
       </w:pPr>
       <w:r>
         <w:t xml:space="preserve">4. Los 10 pasos</w:t>
+      </w:r>
+    </w:p>
+    <w:p>
+      <w:pPr>
+        <w:spacing w:after="100"/>
+      </w:pPr>
+      <w:r>
+        <w:t xml:space="preserve">Cambio en esta versión: entra un paso 2 nuevo sobre la calidad de las etiquetas (absorbe el antiguo paso 5); LP-FT pasa a 3 y la entrada v2 a 4.</w:t>
       </w:r>
     </w:p>
     <w:tbl>
@@ -513,7 +534,7 @@
               <w:spacing w:after="20"/>
             </w:pPr>
             <w:r>
-              <w:t xml:space="preserve">Barrido de 7–8 backbones con la receta de exp002: de MobileNetV4 y EfficientNetV2 a DINOv3-S, DINOv2-S (control) y CoAtNet-384 (techo).</w:t>
+              <w:t xml:space="preserve">Barrido de 7 backbones con la receta de exp002: de MobileNetV4 y EfficientNetV2 a DINOv3-S, DINOv2-S (control) y CoAtNet-2 (techo).</w:t>
             </w:r>
           </w:p>
         </w:tc>
@@ -538,7 +559,7 @@
               <w:spacing w:after="20"/>
             </w:pPr>
             <w:r>
-              <w:t xml:space="preserve">Top 3 del frente de Pareto</w:t>
+              <w:t xml:space="preserve">Hecho: ninguno supera a DINOv2-S (ver bitácora)</w:t>
             </w:r>
           </w:p>
         </w:tc>
@@ -621,7 +642,7 @@
               <w:spacing w:after="20"/>
             </w:pPr>
             <w:r>
-              <w:t xml:space="preserve">¿Cómo adaptamos mejor esos 3 backbones?</w:t>
+              <w:t xml:space="preserve">¿Quién etiqueta mejor?</w:t>
             </w:r>
           </w:p>
         </w:tc>
@@ -647,7 +668,7 @@
               <w:spacing w:after="20"/>
             </w:pPr>
             <w:r>
-              <w:t xml:space="preserve">Un cambio grande que no toque la inferencia: LP-FT (primero cabeza, luego backbone) y adaptación fusionable tipo LoRA/SSF, más warmup.</w:t>
+              <w:t xml:space="preserve">Varios LLM abiertos locales etiquetan los mismos informes; se miden contra un set "silver" hecho a mano; consenso, "no mencionado" distinto de "negativo", limpieza con OOF.</w:t>
             </w:r>
           </w:p>
         </w:tc>
@@ -673,7 +694,7 @@
               <w:spacing w:after="20"/>
             </w:pPr>
             <w:r>
-              <w:t xml:space="preserve">Receta de ajuste estable para los 3</w:t>
+              <w:t xml:space="preserve">Etiquetas v2 + etiquetador elegido</w:t>
             </w:r>
           </w:p>
         </w:tc>
@@ -699,7 +720,7 @@
               <w:spacing w:after="20"/>
             </w:pPr>
             <w:r>
-              <w:t xml:space="preserve">Rodrigo + Claude</w:t>
+              <w:t xml:space="preserve">Rodrigo + equipo</w:t>
             </w:r>
           </w:p>
         </w:tc>
@@ -755,7 +776,7 @@
               <w:spacing w:after="20"/>
             </w:pPr>
             <w:r>
-              <w:t xml:space="preserve">¿Qué entrada le damos al modelo?</w:t>
+              <w:t xml:space="preserve">¿Cómo adaptamos mejor los 3 backbones?</w:t>
             </w:r>
           </w:p>
         </w:tc>
@@ -780,7 +801,7 @@
               <w:spacing w:after="20"/>
             </w:pPr>
             <w:r>
-              <w:t xml:space="preserve">Preprocesamiento v2: recorte físico de la rodilla, lateralidad alineada, series elegidas por metadatos, resolución menor si el recorte lo permite.</w:t>
+              <w:t xml:space="preserve">Un cambio grande que no toque la inferencia: LP-FT (primero cabeza, luego backbone) y adaptación fusionable tipo LoRA/SSF, más warmup.</w:t>
             </w:r>
           </w:p>
         </w:tc>
@@ -805,7 +826,7 @@
               <w:spacing w:after="20"/>
             </w:pPr>
             <w:r>
-              <w:t xml:space="preserve">Cache v2 + ganancia medida</w:t>
+              <w:t xml:space="preserve">Receta de ajuste estable para los 3</w:t>
             </w:r>
           </w:p>
         </w:tc>
@@ -888,7 +909,7 @@
               <w:spacing w:after="20"/>
             </w:pPr>
             <w:r>
-              <w:t xml:space="preserve">¿Cómo junta el modelo cortes y series?</w:t>
+              <w:t xml:space="preserve">¿Qué entrada le damos al modelo?</w:t>
             </w:r>
           </w:p>
         </w:tc>
@@ -914,7 +935,7 @@
               <w:spacing w:after="20"/>
             </w:pPr>
             <w:r>
-              <w:t xml:space="preserve">Cabeza que decide qué mira cada hallazgo (una consulta por etiqueta) contra la atención actual y contra la simple media.</w:t>
+              <w:t xml:space="preserve">Entrada v2: series por metadatos (slots), lateralidad alineada, recorte físico de la rodilla, resolución menor si el recorte lo permite.</w:t>
             </w:r>
           </w:p>
         </w:tc>
@@ -940,7 +961,7 @@
               <w:spacing w:after="20"/>
             </w:pPr>
             <w:r>
-              <w:t xml:space="preserve">Cabeza elegida</w:t>
+              <w:t xml:space="preserve">Cache v2 (ya construido) + ganancia medida</w:t>
             </w:r>
           </w:p>
         </w:tc>
@@ -966,7 +987,7 @@
               <w:spacing w:after="20"/>
             </w:pPr>
             <w:r>
-              <w:t xml:space="preserve">Equipo</w:t>
+              <w:t xml:space="preserve">Rodrigo + Claude</w:t>
             </w:r>
           </w:p>
         </w:tc>
@@ -1022,7 +1043,7 @@
               <w:spacing w:after="20"/>
             </w:pPr>
             <w:r>
-              <w:t xml:space="preserve">¿Qué tan buenas son las etiquetas?</w:t>
+              <w:t xml:space="preserve">¿Cómo junta el modelo cortes y series?</w:t>
             </w:r>
           </w:p>
         </w:tc>
@@ -1047,7 +1068,7 @@
               <w:spacing w:after="20"/>
             </w:pPr>
             <w:r>
-              <w:t xml:space="preserve">Pseudo-etiquetas v2: varios LLM de acuerdo, "no mencionado" distinto de "negativo", limpieza con predicciones OOF, pérdidas robustas al ruido.</w:t>
+              <w:t xml:space="preserve">Cabeza que decide qué mira cada hallazgo (una consulta por etiqueta) contra la atención actual y contra la simple media.</w:t>
             </w:r>
           </w:p>
         </w:tc>
@@ -1072,7 +1093,7 @@
               <w:spacing w:after="20"/>
             </w:pPr>
             <w:r>
-              <w:t xml:space="preserve">Etiquetas v2</w:t>
+              <w:t xml:space="preserve">Cabeza elegida</w:t>
             </w:r>
           </w:p>
         </w:tc>
@@ -1779,7 +1800,7 @@
         <w:spacing w:after="80" w:before="200"/>
       </w:pPr>
       <w:r>
-        <w:t xml:space="preserve">Paso 1 · Barrido de backbones</w:t>
+        <w:t xml:space="preserve">Paso 1 · Barrido de backbones (cerrado)</w:t>
       </w:r>
     </w:p>
     <w:p>
@@ -1787,7 +1808,7 @@
         <w:spacing w:after="100"/>
       </w:pPr>
       <w:r>
-        <w:t xml:space="preserve">Misma receta que exp002, solo cambia el backbone. Candidatos que cubren de barato a caro: MobileNetV4-M (384), EfficientNetV2-B3, ViT-tiny DINOv3, DINOv3-S/16, DINOv2-S (control), ConvNeXt-T DINOv3 y CoAtNet-384. La evidencia dice que un backbone más grande casi nunca paga en médico; queremos verlo con nuestros datos. Salen los 3 mejores por AUC y costo.</w:t>
+        <w:t xml:space="preserve">Misma receta que exp002, solo cambia el backbone; 7 modelos de barato (MobileNetV4-M) a caro (CoAtNet-2). Resultado en la bitácora: DINOv2-S sigue arriba y el costo extra no paga.</w:t>
       </w:r>
     </w:p>
     <w:p>
@@ -1796,7 +1817,7 @@
         <w:spacing w:after="80" w:before="200"/>
       </w:pPr>
       <w:r>
-        <w:t xml:space="preserve">Paso 2 · Un cambio grande sobre los 3 mejores</w:t>
+        <w:t xml:space="preserve">Paso 2 · ¿Quién etiqueta mejor? (nuevo)</w:t>
       </w:r>
     </w:p>
     <w:p>
@@ -1804,7 +1825,122 @@
         <w:spacing w:after="100"/>
       </w:pPr>
       <w:r>
-        <w:t xml:space="preserve">exp002 colapsó en el fold 1 al descongelar el backbone. LP-FT (entrenar primero solo la cabeza y luego todo) ataca justo eso y no cuesta nada en inferencia. La variante con LoRA/SSF se fusiona con los pesos, así que tampoco suma costo. Se prueba sobre los 3 backbones del paso 1.</w:t>
+        <w:t xml:space="preserve">Idea de Rodrigo. Las pseudo-etiquetas v1 salen de Qwen2.5-7B leyendo los informes: acuerdo ≈ 0.80 contra los 58 gold, flojas en MCL, Effusion y Synovitis, y "no mencionado" quedó como 0.5. Si las etiquetas son el techo, cambiar de backbone no lo mueve.</w:t>
+      </w:r>
+    </w:p>
+    <w:p>
+      <w:pPr>
+        <w:pStyle w:val="ListParagraph"/>
+        <w:numPr>
+          <w:ilvl w:val="0"/>
+          <w:numId w:val="2"/>
+        </w:numPr>
+        <w:spacing w:after="60"/>
+      </w:pPr>
+      <w:r>
+        <w:rPr>
+          <w:b/>
+          <w:bCs/>
+        </w:rPr>
+        <w:t xml:space="preserve">Candidatos</w:t>
+      </w:r>
+      <w:r>
+        <w:t xml:space="preserve">, todos abiertos y en nuestra GPU: Qwen2.5-7B (actual), Qwen3-8B, Qwen2.5-72B o Llama-3.3-70B cuantizados, MedGemma-27B y el consenso de varios.</w:t>
+      </w:r>
+    </w:p>
+    <w:p>
+      <w:pPr>
+        <w:pStyle w:val="ListParagraph"/>
+        <w:numPr>
+          <w:ilvl w:val="0"/>
+          <w:numId w:val="2"/>
+        </w:numPr>
+        <w:spacing w:after="60"/>
+      </w:pPr>
+      <w:r>
+        <w:rPr>
+          <w:b/>
+          <w:bCs/>
+        </w:rPr>
+        <w:t xml:space="preserve">Cómo se juntan</w:t>
+      </w:r>
+      <w:r>
+        <w:t xml:space="preserve">: mismo prompt y misma salida por hallazgo (positivo / negativo / no mencionado / incierto); acuerdo entre LLM por hallazgo (kappa); voto mayoritario o promedio de probabilidades como soft label; los desacuerdos quedan como inciertos con peso bajo o van a revisión humana. "No mencionado" no es "negativo". GreenRFM ya usa consenso de 2 LLM en rodilla.</w:t>
+      </w:r>
+    </w:p>
+    <w:p>
+      <w:pPr>
+        <w:pStyle w:val="ListParagraph"/>
+        <w:numPr>
+          <w:ilvl w:val="0"/>
+          <w:numId w:val="2"/>
+        </w:numPr>
+        <w:spacing w:after="60"/>
+      </w:pPr>
+      <w:r>
+        <w:rPr>
+          <w:b/>
+          <w:bCs/>
+        </w:rPr>
+        <w:t xml:space="preserve">Por qué no Claude o GPT por API</w:t>
+      </w:r>
+      <w:r>
+        <w:t xml:space="preserve">: la regla §1 de la competencia prohíbe transmitir Competition Data a terceros, y para el journal un LLM abierto es reproducible y más limpio éticamente.</w:t>
+      </w:r>
+    </w:p>
+    <w:p>
+      <w:pPr>
+        <w:pStyle w:val="ListParagraph"/>
+        <w:numPr>
+          <w:ilvl w:val="0"/>
+          <w:numId w:val="2"/>
+        </w:numPr>
+        <w:spacing w:after="60"/>
+      </w:pPr>
+      <w:r>
+        <w:rPr>
+          <w:b/>
+          <w:bCs/>
+        </w:rPr>
+        <w:t xml:space="preserve">Contra qué se comparan</w:t>
+      </w:r>
+      <w:r>
+        <w:t xml:space="preserve">: no contra los 58 gold (gold solo veta). El equipo etiqueta a mano un set "silver" de ~200 informes leyendo el texto (1–2 h). Con silver se elige etiquetador; gold queda limpio para el paper.</w:t>
+      </w:r>
+    </w:p>
+    <w:p>
+      <w:pPr>
+        <w:pStyle w:val="ListParagraph"/>
+        <w:numPr>
+          <w:ilvl w:val="0"/>
+          <w:numId w:val="2"/>
+        </w:numPr>
+        <w:spacing w:after="60"/>
+      </w:pPr>
+      <w:r>
+        <w:rPr>
+          <w:b/>
+          <w:bCs/>
+        </w:rPr>
+        <w:t xml:space="preserve">Prueba real</w:t>
+      </w:r>
+      <w:r>
+        <w:t xml:space="preserve">: reentrenar el mejor modelo del paso 1 con las etiquetas ganadoras; juez = gold + Kaggle. Ojo: al cambiar las etiquetas la pseudo-AUC cambia de significado, así que antes y después no se comparan por pseudo.</w:t>
+      </w:r>
+    </w:p>
+    <w:p>
+      <w:pPr>
+        <w:spacing w:after="100"/>
+      </w:pPr>
+      <w:r>
+        <w:rPr>
+          <w:b/>
+          <w:bCs/>
+        </w:rPr>
+        <w:t xml:space="preserve">Decisiones pendientes de Rodrigo</w:t>
+      </w:r>
+      <w:r>
+        <w:t xml:space="preserve">: (a) OK a LLM abiertos en vez de Claude; (b) armar el set silver; (c) los 3 backbones que siguen: propuesta DINOv2-S, ConvNeXt-T DINOv3 y ConvNeXtV2-N (o CoAtNet-2).</w:t>
       </w:r>
     </w:p>
     <w:p>
@@ -1813,7 +1949,7 @@
         <w:spacing w:after="80" w:before="200"/>
       </w:pPr>
       <w:r>
-        <w:t xml:space="preserve">Paso 3 · Preprocesamiento v2</w:t>
+        <w:t xml:space="preserve">Paso 3 · Un cambio grande sobre los 3 backbones</w:t>
       </w:r>
     </w:p>
     <w:p>
@@ -1821,7 +1957,7 @@
         <w:spacing w:after="100"/>
       </w:pPr>
       <w:r>
-        <w:t xml:space="preserve">Todos los ganadores de Kaggle recortan primero la zona de interés. Ideas: recorte físico fijo de la rodilla, alinear izquierda/derecha (los flips confunden medial con lateral), elegir las series por sus metadatos DICOM y bajar la resolución cuando el recorte ya da detalle. Un recorte bien hecho puede subir la AUC y bajar el costo a la vez.</w:t>
+        <w:t xml:space="preserve">exp002 colapsó en el fold 1 al descongelar el backbone. LP-FT (entrenar primero solo la cabeza y luego todo) ataca justo eso y no cuesta nada en inferencia. La variante con LoRA/SSF se fusiona con los pesos, así que tampoco suma costo. Se prueba sobre los 3 backbones elegidos.</w:t>
       </w:r>
     </w:p>
     <w:p>
@@ -1830,7 +1966,24 @@
         <w:spacing w:after="80" w:before="200"/>
       </w:pPr>
       <w:r>
-        <w:t xml:space="preserve">Pasos 4–10</w:t>
+        <w:t xml:space="preserve">Paso 4 · Entrada v2</w:t>
+      </w:r>
+    </w:p>
+    <w:p>
+      <w:pPr>
+        <w:spacing w:after="100"/>
+      </w:pPr>
+      <w:r>
+        <w:t xml:space="preserve">Diseño en docs/pasos/paso3_entrada_v2.md (escrito cuando era el paso 3). Series elegidas por 6 slots de contenido según metadatos DICOM, espejado a rodilla derecha y recorte físico de 130 mm a 0.5 mm/px; luego se prueba bajar la resolución. Una variable por experimento (3a–3f en ese documento), cada uno sobre el mejor anterior.</w:t>
+      </w:r>
+    </w:p>
+    <w:p>
+      <w:pPr>
+        <w:pStyle w:val="Heading2"/>
+        <w:spacing w:after="80" w:before="200"/>
+      </w:pPr>
+      <w:r>
+        <w:t xml:space="preserve">Pasos 5–10</w:t>
       </w:r>
     </w:p>
     <w:p>
@@ -2203,7 +2356,7 @@
               <w:spacing w:after="20"/>
             </w:pPr>
             <w:r>
-              <w:t xml:space="preserve">pendiente</w:t>
+              <w:t xml:space="preserve">Ningún backbone supera a DINOv2-S (pseudo 0.827 en fold 0). ConvNeXtV2-N: −0.025 con 60 % menos GMACs.</w:t>
             </w:r>
           </w:p>
         </w:tc>
@@ -2227,6 +2380,9 @@
             <w:pPr>
               <w:spacing w:after="20"/>
             </w:pPr>
+            <w:r>
+              <w:t xml:space="preserve">Más grande no paga: CoAtNet-2 queda cerca (−0.012) con 2.5× el cómputo. Pseudo y gold ordenan igual a los 7 modelos.</w:t>
+            </w:r>
           </w:p>
         </w:tc>
         <w:tc>
@@ -2249,6 +2405,9 @@
             <w:pPr>
               <w:spacing w:after="20"/>
             </w:pPr>
+            <w:r>
+              <w:t xml:space="preserve">Propuesta: DINOv2-S, ConvNeXt-T DINOv3, ConvNeXtV2-N (decide Rodrigo).</w:t>
+            </w:r>
           </w:p>
         </w:tc>
       </w:tr>
@@ -2457,6 +2616,1754 @@
         </w:tc>
       </w:tr>
     </w:tbl>
+    <w:p>
+      <w:pPr>
+        <w:pStyle w:val="Heading2"/>
+        <w:spacing w:after="80" w:before="200"/>
+      </w:pPr>
+      <w:r>
+        <w:t xml:space="preserve">Paso 1 · Números (fold 0)</w:t>
+      </w:r>
+    </w:p>
+    <w:tbl>
+      <w:tblPr>
+        <w:tblW w:type="dxa" w:w="9360"/>
+        <w:tblBorders>
+          <w:top w:val="single" w:color="auto" w:sz="4"/>
+          <w:left w:val="single" w:color="auto" w:sz="4"/>
+          <w:bottom w:val="single" w:color="auto" w:sz="4"/>
+          <w:right w:val="single" w:color="auto" w:sz="4"/>
+          <w:insideH w:val="single" w:color="auto" w:sz="4"/>
+          <w:insideV w:val="single" w:color="auto" w:sz="4"/>
+        </w:tblBorders>
+      </w:tblPr>
+      <w:tblGrid>
+        <w:gridCol w:w="2900"/>
+        <w:gridCol w:w="950"/>
+        <w:gridCol w:w="950"/>
+        <w:gridCol w:w="1000"/>
+        <w:gridCol w:w="1000"/>
+        <w:gridCol w:w="1300"/>
+        <w:gridCol w:w="1260"/>
+      </w:tblGrid>
+      <w:tr>
+        <w:trPr>
+          <w:cantSplit/>
+          <w:tblHeader/>
+        </w:trPr>
+        <w:tc>
+          <w:tcPr>
+            <w:tcW w:type="dxa" w:w="2900"/>
+            <w:tcBorders>
+              <w:top w:val="single" w:color="BFBFBF" w:sz="4"/>
+              <w:left w:val="single" w:color="BFBFBF" w:sz="4"/>
+              <w:bottom w:val="single" w:color="BFBFBF" w:sz="4"/>
+              <w:right w:val="single" w:color="BFBFBF" w:sz="4"/>
+            </w:tcBorders>
+            <w:shd w:fill="1F4E79" w:color="auto" w:val="clear"/>
+            <w:tcMar>
+              <w:top w:type="dxa" w:w="60"/>
+              <w:left w:type="dxa" w:w="100"/>
+              <w:bottom w:type="dxa" w:w="60"/>
+              <w:right w:type="dxa" w:w="100"/>
+            </w:tcMar>
+          </w:tcPr>
+          <w:p>
+            <w:pPr>
+              <w:spacing w:after="20"/>
+            </w:pPr>
+            <w:r>
+              <w:rPr>
+                <w:b/>
+                <w:bCs/>
+                <w:color w:val="FFFFFF"/>
+                <w:sz w:val="19"/>
+                <w:szCs w:val="19"/>
+              </w:rPr>
+              <w:t xml:space="preserve">Backbone (exp)</w:t>
+            </w:r>
+          </w:p>
+        </w:tc>
+        <w:tc>
+          <w:tcPr>
+            <w:tcW w:type="dxa" w:w="950"/>
+            <w:tcBorders>
+              <w:top w:val="single" w:color="BFBFBF" w:sz="4"/>
+              <w:left w:val="single" w:color="BFBFBF" w:sz="4"/>
+              <w:bottom w:val="single" w:color="BFBFBF" w:sz="4"/>
+              <w:right w:val="single" w:color="BFBFBF" w:sz="4"/>
+            </w:tcBorders>
+            <w:shd w:fill="1F4E79" w:color="auto" w:val="clear"/>
+            <w:tcMar>
+              <w:top w:type="dxa" w:w="60"/>
+              <w:left w:type="dxa" w:w="100"/>
+              <w:bottom w:type="dxa" w:w="60"/>
+              <w:right w:type="dxa" w:w="100"/>
+            </w:tcMar>
+          </w:tcPr>
+          <w:p>
+            <w:pPr>
+              <w:spacing w:after="20"/>
+            </w:pPr>
+            <w:r>
+              <w:rPr>
+                <w:b/>
+                <w:bCs/>
+                <w:color w:val="FFFFFF"/>
+                <w:sz w:val="19"/>
+                <w:szCs w:val="19"/>
+              </w:rPr>
+              <w:t xml:space="preserve">Pseudo f0</w:t>
+            </w:r>
+          </w:p>
+        </w:tc>
+        <w:tc>
+          <w:tcPr>
+            <w:tcW w:type="dxa" w:w="950"/>
+            <w:tcBorders>
+              <w:top w:val="single" w:color="BFBFBF" w:sz="4"/>
+              <w:left w:val="single" w:color="BFBFBF" w:sz="4"/>
+              <w:bottom w:val="single" w:color="BFBFBF" w:sz="4"/>
+              <w:right w:val="single" w:color="BFBFBF" w:sz="4"/>
+            </w:tcBorders>
+            <w:shd w:fill="1F4E79" w:color="auto" w:val="clear"/>
+            <w:tcMar>
+              <w:top w:type="dxa" w:w="60"/>
+              <w:left w:type="dxa" w:w="100"/>
+              <w:bottom w:type="dxa" w:w="60"/>
+              <w:right w:type="dxa" w:w="100"/>
+            </w:tcMar>
+          </w:tcPr>
+          <w:p>
+            <w:pPr>
+              <w:spacing w:after="20"/>
+            </w:pPr>
+            <w:r>
+              <w:rPr>
+                <w:b/>
+                <w:bCs/>
+                <w:color w:val="FFFFFF"/>
+                <w:sz w:val="19"/>
+                <w:szCs w:val="19"/>
+              </w:rPr>
+              <w:t xml:space="preserve">Gold f0</w:t>
+            </w:r>
+          </w:p>
+        </w:tc>
+        <w:tc>
+          <w:tcPr>
+            <w:tcW w:type="dxa" w:w="1000"/>
+            <w:tcBorders>
+              <w:top w:val="single" w:color="BFBFBF" w:sz="4"/>
+              <w:left w:val="single" w:color="BFBFBF" w:sz="4"/>
+              <w:bottom w:val="single" w:color="BFBFBF" w:sz="4"/>
+              <w:right w:val="single" w:color="BFBFBF" w:sz="4"/>
+            </w:tcBorders>
+            <w:shd w:fill="1F4E79" w:color="auto" w:val="clear"/>
+            <w:tcMar>
+              <w:top w:type="dxa" w:w="60"/>
+              <w:left w:type="dxa" w:w="100"/>
+              <w:bottom w:type="dxa" w:w="60"/>
+              <w:right w:type="dxa" w:w="100"/>
+            </w:tcMar>
+          </w:tcPr>
+          <w:p>
+            <w:pPr>
+              <w:spacing w:after="20"/>
+            </w:pPr>
+            <w:r>
+              <w:rPr>
+                <w:b/>
+                <w:bCs/>
+                <w:color w:val="FFFFFF"/>
+                <w:sz w:val="19"/>
+                <w:szCs w:val="19"/>
+              </w:rPr>
+              <w:t xml:space="preserve">Δ pseudo</w:t>
+            </w:r>
+          </w:p>
+        </w:tc>
+        <w:tc>
+          <w:tcPr>
+            <w:tcW w:type="dxa" w:w="1000"/>
+            <w:tcBorders>
+              <w:top w:val="single" w:color="BFBFBF" w:sz="4"/>
+              <w:left w:val="single" w:color="BFBFBF" w:sz="4"/>
+              <w:bottom w:val="single" w:color="BFBFBF" w:sz="4"/>
+              <w:right w:val="single" w:color="BFBFBF" w:sz="4"/>
+            </w:tcBorders>
+            <w:shd w:fill="1F4E79" w:color="auto" w:val="clear"/>
+            <w:tcMar>
+              <w:top w:type="dxa" w:w="60"/>
+              <w:left w:type="dxa" w:w="100"/>
+              <w:bottom w:type="dxa" w:w="60"/>
+              <w:right w:type="dxa" w:w="100"/>
+            </w:tcMar>
+          </w:tcPr>
+          <w:p>
+            <w:pPr>
+              <w:spacing w:after="20"/>
+            </w:pPr>
+            <w:r>
+              <w:rPr>
+                <w:b/>
+                <w:bCs/>
+                <w:color w:val="FFFFFF"/>
+                <w:sz w:val="19"/>
+                <w:szCs w:val="19"/>
+              </w:rPr>
+              <w:t xml:space="preserve">Δ gold</w:t>
+            </w:r>
+          </w:p>
+        </w:tc>
+        <w:tc>
+          <w:tcPr>
+            <w:tcW w:type="dxa" w:w="1300"/>
+            <w:tcBorders>
+              <w:top w:val="single" w:color="BFBFBF" w:sz="4"/>
+              <w:left w:val="single" w:color="BFBFBF" w:sz="4"/>
+              <w:bottom w:val="single" w:color="BFBFBF" w:sz="4"/>
+              <w:right w:val="single" w:color="BFBFBF" w:sz="4"/>
+            </w:tcBorders>
+            <w:shd w:fill="1F4E79" w:color="auto" w:val="clear"/>
+            <w:tcMar>
+              <w:top w:type="dxa" w:w="60"/>
+              <w:left w:type="dxa" w:w="100"/>
+              <w:bottom w:type="dxa" w:w="60"/>
+              <w:right w:type="dxa" w:w="100"/>
+            </w:tcMar>
+          </w:tcPr>
+          <w:p>
+            <w:pPr>
+              <w:spacing w:after="20"/>
+            </w:pPr>
+            <w:r>
+              <w:rPr>
+                <w:b/>
+                <w:bCs/>
+                <w:color w:val="FFFFFF"/>
+                <w:sz w:val="19"/>
+                <w:szCs w:val="19"/>
+              </w:rPr>
+              <w:t xml:space="preserve">GMACs</w:t>
+            </w:r>
+          </w:p>
+          <w:p>
+            <w:pPr>
+              <w:spacing w:after="20"/>
+            </w:pPr>
+            <w:r>
+              <w:rPr>
+                <w:b/>
+                <w:bCs/>
+                <w:color w:val="FFFFFF"/>
+                <w:sz w:val="19"/>
+                <w:szCs w:val="19"/>
+              </w:rPr>
+              <w:t xml:space="preserve">/estudio</w:t>
+            </w:r>
+          </w:p>
+        </w:tc>
+        <w:tc>
+          <w:tcPr>
+            <w:tcW w:type="dxa" w:w="1260"/>
+            <w:tcBorders>
+              <w:top w:val="single" w:color="BFBFBF" w:sz="4"/>
+              <w:left w:val="single" w:color="BFBFBF" w:sz="4"/>
+              <w:bottom w:val="single" w:color="BFBFBF" w:sz="4"/>
+              <w:right w:val="single" w:color="BFBFBF" w:sz="4"/>
+            </w:tcBorders>
+            <w:shd w:fill="1F4E79" w:color="auto" w:val="clear"/>
+            <w:tcMar>
+              <w:top w:type="dxa" w:w="60"/>
+              <w:left w:type="dxa" w:w="100"/>
+              <w:bottom w:type="dxa" w:w="60"/>
+              <w:right w:type="dxa" w:w="100"/>
+            </w:tcMar>
+          </w:tcPr>
+          <w:p>
+            <w:pPr>
+              <w:spacing w:after="20"/>
+            </w:pPr>
+            <w:r>
+              <w:rPr>
+                <w:b/>
+                <w:bCs/>
+                <w:color w:val="FFFFFF"/>
+                <w:sz w:val="19"/>
+                <w:szCs w:val="19"/>
+              </w:rPr>
+              <w:t xml:space="preserve">ms</w:t>
+            </w:r>
+          </w:p>
+          <w:p>
+            <w:pPr>
+              <w:spacing w:after="20"/>
+            </w:pPr>
+            <w:r>
+              <w:rPr>
+                <w:b/>
+                <w:bCs/>
+                <w:color w:val="FFFFFF"/>
+                <w:sz w:val="19"/>
+                <w:szCs w:val="19"/>
+              </w:rPr>
+              <w:t xml:space="preserve">/estudio</w:t>
+            </w:r>
+          </w:p>
+        </w:tc>
+      </w:tr>
+      <w:tr>
+        <w:trPr>
+          <w:cantSplit/>
+          <w:tblHeader w:val="false"/>
+        </w:trPr>
+        <w:tc>
+          <w:tcPr>
+            <w:tcW w:type="dxa" w:w="2900"/>
+            <w:tcBorders>
+              <w:top w:val="single" w:color="BFBFBF" w:sz="4"/>
+              <w:left w:val="single" w:color="BFBFBF" w:sz="4"/>
+              <w:bottom w:val="single" w:color="BFBFBF" w:sz="4"/>
+              <w:right w:val="single" w:color="BFBFBF" w:sz="4"/>
+            </w:tcBorders>
+            <w:tcMar>
+              <w:top w:type="dxa" w:w="60"/>
+              <w:left w:type="dxa" w:w="100"/>
+              <w:bottom w:type="dxa" w:w="60"/>
+              <w:right w:type="dxa" w:w="100"/>
+            </w:tcMar>
+          </w:tcPr>
+          <w:p>
+            <w:pPr>
+              <w:spacing w:after="20"/>
+            </w:pPr>
+            <w:r>
+              <w:rPr>
+                <w:b/>
+                <w:bCs/>
+              </w:rPr>
+              <w:t xml:space="preserve">DINOv2-S (exp002, padre)</w:t>
+            </w:r>
+          </w:p>
+        </w:tc>
+        <w:tc>
+          <w:tcPr>
+            <w:tcW w:type="dxa" w:w="950"/>
+            <w:tcBorders>
+              <w:top w:val="single" w:color="BFBFBF" w:sz="4"/>
+              <w:left w:val="single" w:color="BFBFBF" w:sz="4"/>
+              <w:bottom w:val="single" w:color="BFBFBF" w:sz="4"/>
+              <w:right w:val="single" w:color="BFBFBF" w:sz="4"/>
+            </w:tcBorders>
+            <w:tcMar>
+              <w:top w:type="dxa" w:w="60"/>
+              <w:left w:type="dxa" w:w="100"/>
+              <w:bottom w:type="dxa" w:w="60"/>
+              <w:right w:type="dxa" w:w="100"/>
+            </w:tcMar>
+          </w:tcPr>
+          <w:p>
+            <w:pPr>
+              <w:spacing w:after="20"/>
+            </w:pPr>
+            <w:r>
+              <w:rPr>
+                <w:b/>
+                <w:bCs/>
+              </w:rPr>
+              <w:t xml:space="preserve">0.827</w:t>
+            </w:r>
+          </w:p>
+        </w:tc>
+        <w:tc>
+          <w:tcPr>
+            <w:tcW w:type="dxa" w:w="950"/>
+            <w:tcBorders>
+              <w:top w:val="single" w:color="BFBFBF" w:sz="4"/>
+              <w:left w:val="single" w:color="BFBFBF" w:sz="4"/>
+              <w:bottom w:val="single" w:color="BFBFBF" w:sz="4"/>
+              <w:right w:val="single" w:color="BFBFBF" w:sz="4"/>
+            </w:tcBorders>
+            <w:tcMar>
+              <w:top w:type="dxa" w:w="60"/>
+              <w:left w:type="dxa" w:w="100"/>
+              <w:bottom w:type="dxa" w:w="60"/>
+              <w:right w:type="dxa" w:w="100"/>
+            </w:tcMar>
+          </w:tcPr>
+          <w:p>
+            <w:pPr>
+              <w:spacing w:after="20"/>
+            </w:pPr>
+            <w:r>
+              <w:rPr>
+                <w:b/>
+                <w:bCs/>
+              </w:rPr>
+              <w:t xml:space="preserve">0.776</w:t>
+            </w:r>
+          </w:p>
+        </w:tc>
+        <w:tc>
+          <w:tcPr>
+            <w:tcW w:type="dxa" w:w="1000"/>
+            <w:tcBorders>
+              <w:top w:val="single" w:color="BFBFBF" w:sz="4"/>
+              <w:left w:val="single" w:color="BFBFBF" w:sz="4"/>
+              <w:bottom w:val="single" w:color="BFBFBF" w:sz="4"/>
+              <w:right w:val="single" w:color="BFBFBF" w:sz="4"/>
+            </w:tcBorders>
+            <w:tcMar>
+              <w:top w:type="dxa" w:w="60"/>
+              <w:left w:type="dxa" w:w="100"/>
+              <w:bottom w:type="dxa" w:w="60"/>
+              <w:right w:type="dxa" w:w="100"/>
+            </w:tcMar>
+          </w:tcPr>
+          <w:p>
+            <w:pPr>
+              <w:spacing w:after="20"/>
+            </w:pPr>
+            <w:r>
+              <w:t xml:space="preserve">—</w:t>
+            </w:r>
+          </w:p>
+        </w:tc>
+        <w:tc>
+          <w:tcPr>
+            <w:tcW w:type="dxa" w:w="1000"/>
+            <w:tcBorders>
+              <w:top w:val="single" w:color="BFBFBF" w:sz="4"/>
+              <w:left w:val="single" w:color="BFBFBF" w:sz="4"/>
+              <w:bottom w:val="single" w:color="BFBFBF" w:sz="4"/>
+              <w:right w:val="single" w:color="BFBFBF" w:sz="4"/>
+            </w:tcBorders>
+            <w:tcMar>
+              <w:top w:type="dxa" w:w="60"/>
+              <w:left w:type="dxa" w:w="100"/>
+              <w:bottom w:type="dxa" w:w="60"/>
+              <w:right w:type="dxa" w:w="100"/>
+            </w:tcMar>
+          </w:tcPr>
+          <w:p>
+            <w:pPr>
+              <w:spacing w:after="20"/>
+            </w:pPr>
+            <w:r>
+              <w:t xml:space="preserve">—</w:t>
+            </w:r>
+          </w:p>
+        </w:tc>
+        <w:tc>
+          <w:tcPr>
+            <w:tcW w:type="dxa" w:w="1300"/>
+            <w:tcBorders>
+              <w:top w:val="single" w:color="BFBFBF" w:sz="4"/>
+              <w:left w:val="single" w:color="BFBFBF" w:sz="4"/>
+              <w:bottom w:val="single" w:color="BFBFBF" w:sz="4"/>
+              <w:right w:val="single" w:color="BFBFBF" w:sz="4"/>
+            </w:tcBorders>
+            <w:tcMar>
+              <w:top w:type="dxa" w:w="60"/>
+              <w:left w:type="dxa" w:w="100"/>
+              <w:bottom w:type="dxa" w:w="60"/>
+              <w:right w:type="dxa" w:w="100"/>
+            </w:tcMar>
+          </w:tcPr>
+          <w:p>
+            <w:pPr>
+              <w:spacing w:after="20"/>
+            </w:pPr>
+            <w:r>
+              <w:t xml:space="preserve">490</w:t>
+            </w:r>
+          </w:p>
+        </w:tc>
+        <w:tc>
+          <w:tcPr>
+            <w:tcW w:type="dxa" w:w="1260"/>
+            <w:tcBorders>
+              <w:top w:val="single" w:color="BFBFBF" w:sz="4"/>
+              <w:left w:val="single" w:color="BFBFBF" w:sz="4"/>
+              <w:bottom w:val="single" w:color="BFBFBF" w:sz="4"/>
+              <w:right w:val="single" w:color="BFBFBF" w:sz="4"/>
+            </w:tcBorders>
+            <w:tcMar>
+              <w:top w:type="dxa" w:w="60"/>
+              <w:left w:type="dxa" w:w="100"/>
+              <w:bottom w:type="dxa" w:w="60"/>
+              <w:right w:type="dxa" w:w="100"/>
+            </w:tcMar>
+          </w:tcPr>
+          <w:p>
+            <w:pPr>
+              <w:spacing w:after="20"/>
+            </w:pPr>
+            <w:r>
+              <w:t xml:space="preserve">14.6</w:t>
+            </w:r>
+          </w:p>
+        </w:tc>
+      </w:tr>
+      <w:tr>
+        <w:trPr>
+          <w:cantSplit/>
+          <w:tblHeader w:val="false"/>
+        </w:trPr>
+        <w:tc>
+          <w:tcPr>
+            <w:tcW w:type="dxa" w:w="2900"/>
+            <w:tcBorders>
+              <w:top w:val="single" w:color="BFBFBF" w:sz="4"/>
+              <w:left w:val="single" w:color="BFBFBF" w:sz="4"/>
+              <w:bottom w:val="single" w:color="BFBFBF" w:sz="4"/>
+              <w:right w:val="single" w:color="BFBFBF" w:sz="4"/>
+            </w:tcBorders>
+            <w:shd w:fill="F2F6FA" w:color="auto" w:val="clear"/>
+            <w:tcMar>
+              <w:top w:type="dxa" w:w="60"/>
+              <w:left w:type="dxa" w:w="100"/>
+              <w:bottom w:type="dxa" w:w="60"/>
+              <w:right w:type="dxa" w:w="100"/>
+            </w:tcMar>
+          </w:tcPr>
+          <w:p>
+            <w:pPr>
+              <w:spacing w:after="20"/>
+            </w:pPr>
+            <w:r>
+              <w:t xml:space="preserve">CoAtNet-2 (exp008)</w:t>
+            </w:r>
+          </w:p>
+        </w:tc>
+        <w:tc>
+          <w:tcPr>
+            <w:tcW w:type="dxa" w:w="950"/>
+            <w:tcBorders>
+              <w:top w:val="single" w:color="BFBFBF" w:sz="4"/>
+              <w:left w:val="single" w:color="BFBFBF" w:sz="4"/>
+              <w:bottom w:val="single" w:color="BFBFBF" w:sz="4"/>
+              <w:right w:val="single" w:color="BFBFBF" w:sz="4"/>
+            </w:tcBorders>
+            <w:shd w:fill="F2F6FA" w:color="auto" w:val="clear"/>
+            <w:tcMar>
+              <w:top w:type="dxa" w:w="60"/>
+              <w:left w:type="dxa" w:w="100"/>
+              <w:bottom w:type="dxa" w:w="60"/>
+              <w:right w:type="dxa" w:w="100"/>
+            </w:tcMar>
+          </w:tcPr>
+          <w:p>
+            <w:pPr>
+              <w:spacing w:after="20"/>
+            </w:pPr>
+            <w:r>
+              <w:t xml:space="preserve">0.814</w:t>
+            </w:r>
+          </w:p>
+        </w:tc>
+        <w:tc>
+          <w:tcPr>
+            <w:tcW w:type="dxa" w:w="950"/>
+            <w:tcBorders>
+              <w:top w:val="single" w:color="BFBFBF" w:sz="4"/>
+              <w:left w:val="single" w:color="BFBFBF" w:sz="4"/>
+              <w:bottom w:val="single" w:color="BFBFBF" w:sz="4"/>
+              <w:right w:val="single" w:color="BFBFBF" w:sz="4"/>
+            </w:tcBorders>
+            <w:shd w:fill="F2F6FA" w:color="auto" w:val="clear"/>
+            <w:tcMar>
+              <w:top w:type="dxa" w:w="60"/>
+              <w:left w:type="dxa" w:w="100"/>
+              <w:bottom w:type="dxa" w:w="60"/>
+              <w:right w:type="dxa" w:w="100"/>
+            </w:tcMar>
+          </w:tcPr>
+          <w:p>
+            <w:pPr>
+              <w:spacing w:after="20"/>
+            </w:pPr>
+            <w:r>
+              <w:t xml:space="preserve">0.773</w:t>
+            </w:r>
+          </w:p>
+        </w:tc>
+        <w:tc>
+          <w:tcPr>
+            <w:tcW w:type="dxa" w:w="1000"/>
+            <w:tcBorders>
+              <w:top w:val="single" w:color="BFBFBF" w:sz="4"/>
+              <w:left w:val="single" w:color="BFBFBF" w:sz="4"/>
+              <w:bottom w:val="single" w:color="BFBFBF" w:sz="4"/>
+              <w:right w:val="single" w:color="BFBFBF" w:sz="4"/>
+            </w:tcBorders>
+            <w:shd w:fill="F2F6FA" w:color="auto" w:val="clear"/>
+            <w:tcMar>
+              <w:top w:type="dxa" w:w="60"/>
+              <w:left w:type="dxa" w:w="100"/>
+              <w:bottom w:type="dxa" w:w="60"/>
+              <w:right w:type="dxa" w:w="100"/>
+            </w:tcMar>
+          </w:tcPr>
+          <w:p>
+            <w:pPr>
+              <w:spacing w:after="20"/>
+            </w:pPr>
+            <w:r>
+              <w:t xml:space="preserve">−0.012</w:t>
+            </w:r>
+          </w:p>
+        </w:tc>
+        <w:tc>
+          <w:tcPr>
+            <w:tcW w:type="dxa" w:w="1000"/>
+            <w:tcBorders>
+              <w:top w:val="single" w:color="BFBFBF" w:sz="4"/>
+              <w:left w:val="single" w:color="BFBFBF" w:sz="4"/>
+              <w:bottom w:val="single" w:color="BFBFBF" w:sz="4"/>
+              <w:right w:val="single" w:color="BFBFBF" w:sz="4"/>
+            </w:tcBorders>
+            <w:shd w:fill="F2F6FA" w:color="auto" w:val="clear"/>
+            <w:tcMar>
+              <w:top w:type="dxa" w:w="60"/>
+              <w:left w:type="dxa" w:w="100"/>
+              <w:bottom w:type="dxa" w:w="60"/>
+              <w:right w:type="dxa" w:w="100"/>
+            </w:tcMar>
+          </w:tcPr>
+          <w:p>
+            <w:pPr>
+              <w:spacing w:after="20"/>
+            </w:pPr>
+            <w:r>
+              <w:t xml:space="preserve">−0.003</w:t>
+            </w:r>
+          </w:p>
+        </w:tc>
+        <w:tc>
+          <w:tcPr>
+            <w:tcW w:type="dxa" w:w="1300"/>
+            <w:tcBorders>
+              <w:top w:val="single" w:color="BFBFBF" w:sz="4"/>
+              <w:left w:val="single" w:color="BFBFBF" w:sz="4"/>
+              <w:bottom w:val="single" w:color="BFBFBF" w:sz="4"/>
+              <w:right w:val="single" w:color="BFBFBF" w:sz="4"/>
+            </w:tcBorders>
+            <w:shd w:fill="F2F6FA" w:color="auto" w:val="clear"/>
+            <w:tcMar>
+              <w:top w:type="dxa" w:w="60"/>
+              <w:left w:type="dxa" w:w="100"/>
+              <w:bottom w:type="dxa" w:w="60"/>
+              <w:right w:type="dxa" w:w="100"/>
+            </w:tcMar>
+          </w:tcPr>
+          <w:p>
+            <w:pPr>
+              <w:spacing w:after="20"/>
+            </w:pPr>
+            <w:r>
+              <w:t xml:space="preserve">1,202</w:t>
+            </w:r>
+          </w:p>
+        </w:tc>
+        <w:tc>
+          <w:tcPr>
+            <w:tcW w:type="dxa" w:w="1260"/>
+            <w:tcBorders>
+              <w:top w:val="single" w:color="BFBFBF" w:sz="4"/>
+              <w:left w:val="single" w:color="BFBFBF" w:sz="4"/>
+              <w:bottom w:val="single" w:color="BFBFBF" w:sz="4"/>
+              <w:right w:val="single" w:color="BFBFBF" w:sz="4"/>
+            </w:tcBorders>
+            <w:shd w:fill="F2F6FA" w:color="auto" w:val="clear"/>
+            <w:tcMar>
+              <w:top w:type="dxa" w:w="60"/>
+              <w:left w:type="dxa" w:w="100"/>
+              <w:bottom w:type="dxa" w:w="60"/>
+              <w:right w:type="dxa" w:w="100"/>
+            </w:tcMar>
+          </w:tcPr>
+          <w:p>
+            <w:pPr>
+              <w:spacing w:after="20"/>
+            </w:pPr>
+            <w:r>
+              <w:t xml:space="preserve">65.5</w:t>
+            </w:r>
+          </w:p>
+        </w:tc>
+      </w:tr>
+      <w:tr>
+        <w:trPr>
+          <w:cantSplit/>
+          <w:tblHeader w:val="false"/>
+        </w:trPr>
+        <w:tc>
+          <w:tcPr>
+            <w:tcW w:type="dxa" w:w="2900"/>
+            <w:tcBorders>
+              <w:top w:val="single" w:color="BFBFBF" w:sz="4"/>
+              <w:left w:val="single" w:color="BFBFBF" w:sz="4"/>
+              <w:bottom w:val="single" w:color="BFBFBF" w:sz="4"/>
+              <w:right w:val="single" w:color="BFBFBF" w:sz="4"/>
+            </w:tcBorders>
+            <w:tcMar>
+              <w:top w:type="dxa" w:w="60"/>
+              <w:left w:type="dxa" w:w="100"/>
+              <w:bottom w:type="dxa" w:w="60"/>
+              <w:right w:type="dxa" w:w="100"/>
+            </w:tcMar>
+          </w:tcPr>
+          <w:p>
+            <w:pPr>
+              <w:spacing w:after="20"/>
+            </w:pPr>
+            <w:r>
+              <w:t xml:space="preserve">ConvNeXt-T DINOv3 (exp007)</w:t>
+            </w:r>
+          </w:p>
+        </w:tc>
+        <w:tc>
+          <w:tcPr>
+            <w:tcW w:type="dxa" w:w="950"/>
+            <w:tcBorders>
+              <w:top w:val="single" w:color="BFBFBF" w:sz="4"/>
+              <w:left w:val="single" w:color="BFBFBF" w:sz="4"/>
+              <w:bottom w:val="single" w:color="BFBFBF" w:sz="4"/>
+              <w:right w:val="single" w:color="BFBFBF" w:sz="4"/>
+            </w:tcBorders>
+            <w:tcMar>
+              <w:top w:type="dxa" w:w="60"/>
+              <w:left w:type="dxa" w:w="100"/>
+              <w:bottom w:type="dxa" w:w="60"/>
+              <w:right w:type="dxa" w:w="100"/>
+            </w:tcMar>
+          </w:tcPr>
+          <w:p>
+            <w:pPr>
+              <w:spacing w:after="20"/>
+            </w:pPr>
+            <w:r>
+              <w:t xml:space="preserve">0.808</w:t>
+            </w:r>
+          </w:p>
+        </w:tc>
+        <w:tc>
+          <w:tcPr>
+            <w:tcW w:type="dxa" w:w="950"/>
+            <w:tcBorders>
+              <w:top w:val="single" w:color="BFBFBF" w:sz="4"/>
+              <w:left w:val="single" w:color="BFBFBF" w:sz="4"/>
+              <w:bottom w:val="single" w:color="BFBFBF" w:sz="4"/>
+              <w:right w:val="single" w:color="BFBFBF" w:sz="4"/>
+            </w:tcBorders>
+            <w:tcMar>
+              <w:top w:type="dxa" w:w="60"/>
+              <w:left w:type="dxa" w:w="100"/>
+              <w:bottom w:type="dxa" w:w="60"/>
+              <w:right w:type="dxa" w:w="100"/>
+            </w:tcMar>
+          </w:tcPr>
+          <w:p>
+            <w:pPr>
+              <w:spacing w:after="20"/>
+            </w:pPr>
+            <w:r>
+              <w:t xml:space="preserve">0.767</w:t>
+            </w:r>
+          </w:p>
+        </w:tc>
+        <w:tc>
+          <w:tcPr>
+            <w:tcW w:type="dxa" w:w="1000"/>
+            <w:tcBorders>
+              <w:top w:val="single" w:color="BFBFBF" w:sz="4"/>
+              <w:left w:val="single" w:color="BFBFBF" w:sz="4"/>
+              <w:bottom w:val="single" w:color="BFBFBF" w:sz="4"/>
+              <w:right w:val="single" w:color="BFBFBF" w:sz="4"/>
+            </w:tcBorders>
+            <w:tcMar>
+              <w:top w:type="dxa" w:w="60"/>
+              <w:left w:type="dxa" w:w="100"/>
+              <w:bottom w:type="dxa" w:w="60"/>
+              <w:right w:type="dxa" w:w="100"/>
+            </w:tcMar>
+          </w:tcPr>
+          <w:p>
+            <w:pPr>
+              <w:spacing w:after="20"/>
+            </w:pPr>
+            <w:r>
+              <w:t xml:space="preserve">−0.018</w:t>
+            </w:r>
+          </w:p>
+        </w:tc>
+        <w:tc>
+          <w:tcPr>
+            <w:tcW w:type="dxa" w:w="1000"/>
+            <w:tcBorders>
+              <w:top w:val="single" w:color="BFBFBF" w:sz="4"/>
+              <w:left w:val="single" w:color="BFBFBF" w:sz="4"/>
+              <w:bottom w:val="single" w:color="BFBFBF" w:sz="4"/>
+              <w:right w:val="single" w:color="BFBFBF" w:sz="4"/>
+            </w:tcBorders>
+            <w:tcMar>
+              <w:top w:type="dxa" w:w="60"/>
+              <w:left w:type="dxa" w:w="100"/>
+              <w:bottom w:type="dxa" w:w="60"/>
+              <w:right w:type="dxa" w:w="100"/>
+            </w:tcMar>
+          </w:tcPr>
+          <w:p>
+            <w:pPr>
+              <w:spacing w:after="20"/>
+            </w:pPr>
+            <w:r>
+              <w:t xml:space="preserve">−0.010</w:t>
+            </w:r>
+          </w:p>
+        </w:tc>
+        <w:tc>
+          <w:tcPr>
+            <w:tcW w:type="dxa" w:w="1300"/>
+            <w:tcBorders>
+              <w:top w:val="single" w:color="BFBFBF" w:sz="4"/>
+              <w:left w:val="single" w:color="BFBFBF" w:sz="4"/>
+              <w:bottom w:val="single" w:color="BFBFBF" w:sz="4"/>
+              <w:right w:val="single" w:color="BFBFBF" w:sz="4"/>
+            </w:tcBorders>
+            <w:tcMar>
+              <w:top w:type="dxa" w:w="60"/>
+              <w:left w:type="dxa" w:w="100"/>
+              <w:bottom w:type="dxa" w:w="60"/>
+              <w:right w:type="dxa" w:w="100"/>
+            </w:tcMar>
+          </w:tcPr>
+          <w:p>
+            <w:pPr>
+              <w:spacing w:after="20"/>
+            </w:pPr>
+            <w:r>
+              <w:t xml:space="preserve">356</w:t>
+            </w:r>
+          </w:p>
+        </w:tc>
+        <w:tc>
+          <w:tcPr>
+            <w:tcW w:type="dxa" w:w="1260"/>
+            <w:tcBorders>
+              <w:top w:val="single" w:color="BFBFBF" w:sz="4"/>
+              <w:left w:val="single" w:color="BFBFBF" w:sz="4"/>
+              <w:bottom w:val="single" w:color="BFBFBF" w:sz="4"/>
+              <w:right w:val="single" w:color="BFBFBF" w:sz="4"/>
+            </w:tcBorders>
+            <w:tcMar>
+              <w:top w:type="dxa" w:w="60"/>
+              <w:left w:type="dxa" w:w="100"/>
+              <w:bottom w:type="dxa" w:w="60"/>
+              <w:right w:type="dxa" w:w="100"/>
+            </w:tcMar>
+          </w:tcPr>
+          <w:p>
+            <w:pPr>
+              <w:spacing w:after="20"/>
+            </w:pPr>
+            <w:r>
+              <w:t xml:space="preserve">18.9</w:t>
+            </w:r>
+          </w:p>
+        </w:tc>
+      </w:tr>
+      <w:tr>
+        <w:trPr>
+          <w:cantSplit/>
+          <w:tblHeader w:val="false"/>
+        </w:trPr>
+        <w:tc>
+          <w:tcPr>
+            <w:tcW w:type="dxa" w:w="2900"/>
+            <w:tcBorders>
+              <w:top w:val="single" w:color="BFBFBF" w:sz="4"/>
+              <w:left w:val="single" w:color="BFBFBF" w:sz="4"/>
+              <w:bottom w:val="single" w:color="BFBFBF" w:sz="4"/>
+              <w:right w:val="single" w:color="BFBFBF" w:sz="4"/>
+            </w:tcBorders>
+            <w:shd w:fill="F2F6FA" w:color="auto" w:val="clear"/>
+            <w:tcMar>
+              <w:top w:type="dxa" w:w="60"/>
+              <w:left w:type="dxa" w:w="100"/>
+              <w:bottom w:type="dxa" w:w="60"/>
+              <w:right w:type="dxa" w:w="100"/>
+            </w:tcMar>
+          </w:tcPr>
+          <w:p>
+            <w:pPr>
+              <w:spacing w:after="20"/>
+            </w:pPr>
+            <w:r>
+              <w:t xml:space="preserve">ConvNeXtV2-N (exp005)</w:t>
+            </w:r>
+          </w:p>
+        </w:tc>
+        <w:tc>
+          <w:tcPr>
+            <w:tcW w:type="dxa" w:w="950"/>
+            <w:tcBorders>
+              <w:top w:val="single" w:color="BFBFBF" w:sz="4"/>
+              <w:left w:val="single" w:color="BFBFBF" w:sz="4"/>
+              <w:bottom w:val="single" w:color="BFBFBF" w:sz="4"/>
+              <w:right w:val="single" w:color="BFBFBF" w:sz="4"/>
+            </w:tcBorders>
+            <w:shd w:fill="F2F6FA" w:color="auto" w:val="clear"/>
+            <w:tcMar>
+              <w:top w:type="dxa" w:w="60"/>
+              <w:left w:type="dxa" w:w="100"/>
+              <w:bottom w:type="dxa" w:w="60"/>
+              <w:right w:type="dxa" w:w="100"/>
+            </w:tcMar>
+          </w:tcPr>
+          <w:p>
+            <w:pPr>
+              <w:spacing w:after="20"/>
+            </w:pPr>
+            <w:r>
+              <w:t xml:space="preserve">0.802</w:t>
+            </w:r>
+          </w:p>
+        </w:tc>
+        <w:tc>
+          <w:tcPr>
+            <w:tcW w:type="dxa" w:w="950"/>
+            <w:tcBorders>
+              <w:top w:val="single" w:color="BFBFBF" w:sz="4"/>
+              <w:left w:val="single" w:color="BFBFBF" w:sz="4"/>
+              <w:bottom w:val="single" w:color="BFBFBF" w:sz="4"/>
+              <w:right w:val="single" w:color="BFBFBF" w:sz="4"/>
+            </w:tcBorders>
+            <w:shd w:fill="F2F6FA" w:color="auto" w:val="clear"/>
+            <w:tcMar>
+              <w:top w:type="dxa" w:w="60"/>
+              <w:left w:type="dxa" w:w="100"/>
+              <w:bottom w:type="dxa" w:w="60"/>
+              <w:right w:type="dxa" w:w="100"/>
+            </w:tcMar>
+          </w:tcPr>
+          <w:p>
+            <w:pPr>
+              <w:spacing w:after="20"/>
+            </w:pPr>
+            <w:r>
+              <w:t xml:space="preserve">0.757</w:t>
+            </w:r>
+          </w:p>
+        </w:tc>
+        <w:tc>
+          <w:tcPr>
+            <w:tcW w:type="dxa" w:w="1000"/>
+            <w:tcBorders>
+              <w:top w:val="single" w:color="BFBFBF" w:sz="4"/>
+              <w:left w:val="single" w:color="BFBFBF" w:sz="4"/>
+              <w:bottom w:val="single" w:color="BFBFBF" w:sz="4"/>
+              <w:right w:val="single" w:color="BFBFBF" w:sz="4"/>
+            </w:tcBorders>
+            <w:shd w:fill="F2F6FA" w:color="auto" w:val="clear"/>
+            <w:tcMar>
+              <w:top w:type="dxa" w:w="60"/>
+              <w:left w:type="dxa" w:w="100"/>
+              <w:bottom w:type="dxa" w:w="60"/>
+              <w:right w:type="dxa" w:w="100"/>
+            </w:tcMar>
+          </w:tcPr>
+          <w:p>
+            <w:pPr>
+              <w:spacing w:after="20"/>
+            </w:pPr>
+            <w:r>
+              <w:t xml:space="preserve">−0.025</w:t>
+            </w:r>
+          </w:p>
+        </w:tc>
+        <w:tc>
+          <w:tcPr>
+            <w:tcW w:type="dxa" w:w="1000"/>
+            <w:tcBorders>
+              <w:top w:val="single" w:color="BFBFBF" w:sz="4"/>
+              <w:left w:val="single" w:color="BFBFBF" w:sz="4"/>
+              <w:bottom w:val="single" w:color="BFBFBF" w:sz="4"/>
+              <w:right w:val="single" w:color="BFBFBF" w:sz="4"/>
+            </w:tcBorders>
+            <w:shd w:fill="F2F6FA" w:color="auto" w:val="clear"/>
+            <w:tcMar>
+              <w:top w:type="dxa" w:w="60"/>
+              <w:left w:type="dxa" w:w="100"/>
+              <w:bottom w:type="dxa" w:w="60"/>
+              <w:right w:type="dxa" w:w="100"/>
+            </w:tcMar>
+          </w:tcPr>
+          <w:p>
+            <w:pPr>
+              <w:spacing w:after="20"/>
+            </w:pPr>
+            <w:r>
+              <w:t xml:space="preserve">−0.019</w:t>
+            </w:r>
+          </w:p>
+        </w:tc>
+        <w:tc>
+          <w:tcPr>
+            <w:tcW w:type="dxa" w:w="1300"/>
+            <w:tcBorders>
+              <w:top w:val="single" w:color="BFBFBF" w:sz="4"/>
+              <w:left w:val="single" w:color="BFBFBF" w:sz="4"/>
+              <w:bottom w:val="single" w:color="BFBFBF" w:sz="4"/>
+              <w:right w:val="single" w:color="BFBFBF" w:sz="4"/>
+            </w:tcBorders>
+            <w:shd w:fill="F2F6FA" w:color="auto" w:val="clear"/>
+            <w:tcMar>
+              <w:top w:type="dxa" w:w="60"/>
+              <w:left w:type="dxa" w:w="100"/>
+              <w:bottom w:type="dxa" w:w="60"/>
+              <w:right w:type="dxa" w:w="100"/>
+            </w:tcMar>
+          </w:tcPr>
+          <w:p>
+            <w:pPr>
+              <w:spacing w:after="20"/>
+            </w:pPr>
+            <w:r>
+              <w:t xml:space="preserve">196</w:t>
+            </w:r>
+          </w:p>
+        </w:tc>
+        <w:tc>
+          <w:tcPr>
+            <w:tcW w:type="dxa" w:w="1260"/>
+            <w:tcBorders>
+              <w:top w:val="single" w:color="BFBFBF" w:sz="4"/>
+              <w:left w:val="single" w:color="BFBFBF" w:sz="4"/>
+              <w:bottom w:val="single" w:color="BFBFBF" w:sz="4"/>
+              <w:right w:val="single" w:color="BFBFBF" w:sz="4"/>
+            </w:tcBorders>
+            <w:shd w:fill="F2F6FA" w:color="auto" w:val="clear"/>
+            <w:tcMar>
+              <w:top w:type="dxa" w:w="60"/>
+              <w:left w:type="dxa" w:w="100"/>
+              <w:bottom w:type="dxa" w:w="60"/>
+              <w:right w:type="dxa" w:w="100"/>
+            </w:tcMar>
+          </w:tcPr>
+          <w:p>
+            <w:pPr>
+              <w:spacing w:after="20"/>
+            </w:pPr>
+            <w:r>
+              <w:t xml:space="preserve">24.7</w:t>
+            </w:r>
+          </w:p>
+        </w:tc>
+      </w:tr>
+      <w:tr>
+        <w:trPr>
+          <w:cantSplit/>
+          <w:tblHeader w:val="false"/>
+        </w:trPr>
+        <w:tc>
+          <w:tcPr>
+            <w:tcW w:type="dxa" w:w="2900"/>
+            <w:tcBorders>
+              <w:top w:val="single" w:color="BFBFBF" w:sz="4"/>
+              <w:left w:val="single" w:color="BFBFBF" w:sz="4"/>
+              <w:bottom w:val="single" w:color="BFBFBF" w:sz="4"/>
+              <w:right w:val="single" w:color="BFBFBF" w:sz="4"/>
+            </w:tcBorders>
+            <w:tcMar>
+              <w:top w:type="dxa" w:w="60"/>
+              <w:left w:type="dxa" w:w="100"/>
+              <w:bottom w:type="dxa" w:w="60"/>
+              <w:right w:type="dxa" w:w="100"/>
+            </w:tcMar>
+          </w:tcPr>
+          <w:p>
+            <w:pPr>
+              <w:spacing w:after="20"/>
+            </w:pPr>
+            <w:r>
+              <w:t xml:space="preserve">DINOv3-S (exp006)</w:t>
+            </w:r>
+          </w:p>
+        </w:tc>
+        <w:tc>
+          <w:tcPr>
+            <w:tcW w:type="dxa" w:w="950"/>
+            <w:tcBorders>
+              <w:top w:val="single" w:color="BFBFBF" w:sz="4"/>
+              <w:left w:val="single" w:color="BFBFBF" w:sz="4"/>
+              <w:bottom w:val="single" w:color="BFBFBF" w:sz="4"/>
+              <w:right w:val="single" w:color="BFBFBF" w:sz="4"/>
+            </w:tcBorders>
+            <w:tcMar>
+              <w:top w:type="dxa" w:w="60"/>
+              <w:left w:type="dxa" w:w="100"/>
+              <w:bottom w:type="dxa" w:w="60"/>
+              <w:right w:type="dxa" w:w="100"/>
+            </w:tcMar>
+          </w:tcPr>
+          <w:p>
+            <w:pPr>
+              <w:spacing w:after="20"/>
+            </w:pPr>
+            <w:r>
+              <w:t xml:space="preserve">0.779</w:t>
+            </w:r>
+          </w:p>
+        </w:tc>
+        <w:tc>
+          <w:tcPr>
+            <w:tcW w:type="dxa" w:w="950"/>
+            <w:tcBorders>
+              <w:top w:val="single" w:color="BFBFBF" w:sz="4"/>
+              <w:left w:val="single" w:color="BFBFBF" w:sz="4"/>
+              <w:bottom w:val="single" w:color="BFBFBF" w:sz="4"/>
+              <w:right w:val="single" w:color="BFBFBF" w:sz="4"/>
+            </w:tcBorders>
+            <w:tcMar>
+              <w:top w:type="dxa" w:w="60"/>
+              <w:left w:type="dxa" w:w="100"/>
+              <w:bottom w:type="dxa" w:w="60"/>
+              <w:right w:type="dxa" w:w="100"/>
+            </w:tcMar>
+          </w:tcPr>
+          <w:p>
+            <w:pPr>
+              <w:spacing w:after="20"/>
+            </w:pPr>
+            <w:r>
+              <w:t xml:space="preserve">0.745</w:t>
+            </w:r>
+          </w:p>
+        </w:tc>
+        <w:tc>
+          <w:tcPr>
+            <w:tcW w:type="dxa" w:w="1000"/>
+            <w:tcBorders>
+              <w:top w:val="single" w:color="BFBFBF" w:sz="4"/>
+              <w:left w:val="single" w:color="BFBFBF" w:sz="4"/>
+              <w:bottom w:val="single" w:color="BFBFBF" w:sz="4"/>
+              <w:right w:val="single" w:color="BFBFBF" w:sz="4"/>
+            </w:tcBorders>
+            <w:tcMar>
+              <w:top w:type="dxa" w:w="60"/>
+              <w:left w:type="dxa" w:w="100"/>
+              <w:bottom w:type="dxa" w:w="60"/>
+              <w:right w:type="dxa" w:w="100"/>
+            </w:tcMar>
+          </w:tcPr>
+          <w:p>
+            <w:pPr>
+              <w:spacing w:after="20"/>
+            </w:pPr>
+            <w:r>
+              <w:t xml:space="preserve">−0.047</w:t>
+            </w:r>
+          </w:p>
+        </w:tc>
+        <w:tc>
+          <w:tcPr>
+            <w:tcW w:type="dxa" w:w="1000"/>
+            <w:tcBorders>
+              <w:top w:val="single" w:color="BFBFBF" w:sz="4"/>
+              <w:left w:val="single" w:color="BFBFBF" w:sz="4"/>
+              <w:bottom w:val="single" w:color="BFBFBF" w:sz="4"/>
+              <w:right w:val="single" w:color="BFBFBF" w:sz="4"/>
+            </w:tcBorders>
+            <w:tcMar>
+              <w:top w:type="dxa" w:w="60"/>
+              <w:left w:type="dxa" w:w="100"/>
+              <w:bottom w:type="dxa" w:w="60"/>
+              <w:right w:type="dxa" w:w="100"/>
+            </w:tcMar>
+          </w:tcPr>
+          <w:p>
+            <w:pPr>
+              <w:spacing w:after="20"/>
+            </w:pPr>
+            <w:r>
+              <w:t xml:space="preserve">−0.031</w:t>
+            </w:r>
+          </w:p>
+        </w:tc>
+        <w:tc>
+          <w:tcPr>
+            <w:tcW w:type="dxa" w:w="1300"/>
+            <w:tcBorders>
+              <w:top w:val="single" w:color="BFBFBF" w:sz="4"/>
+              <w:left w:val="single" w:color="BFBFBF" w:sz="4"/>
+              <w:bottom w:val="single" w:color="BFBFBF" w:sz="4"/>
+              <w:right w:val="single" w:color="BFBFBF" w:sz="4"/>
+            </w:tcBorders>
+            <w:tcMar>
+              <w:top w:type="dxa" w:w="60"/>
+              <w:left w:type="dxa" w:w="100"/>
+              <w:bottom w:type="dxa" w:w="60"/>
+              <w:right w:type="dxa" w:w="100"/>
+            </w:tcMar>
+          </w:tcPr>
+          <w:p>
+            <w:pPr>
+              <w:spacing w:after="20"/>
+            </w:pPr>
+            <w:r>
+              <w:t xml:space="preserve">376</w:t>
+            </w:r>
+          </w:p>
+        </w:tc>
+        <w:tc>
+          <w:tcPr>
+            <w:tcW w:type="dxa" w:w="1260"/>
+            <w:tcBorders>
+              <w:top w:val="single" w:color="BFBFBF" w:sz="4"/>
+              <w:left w:val="single" w:color="BFBFBF" w:sz="4"/>
+              <w:bottom w:val="single" w:color="BFBFBF" w:sz="4"/>
+              <w:right w:val="single" w:color="BFBFBF" w:sz="4"/>
+            </w:tcBorders>
+            <w:tcMar>
+              <w:top w:type="dxa" w:w="60"/>
+              <w:left w:type="dxa" w:w="100"/>
+              <w:bottom w:type="dxa" w:w="60"/>
+              <w:right w:type="dxa" w:w="100"/>
+            </w:tcMar>
+          </w:tcPr>
+          <w:p>
+            <w:pPr>
+              <w:spacing w:after="20"/>
+            </w:pPr>
+            <w:r>
+              <w:t xml:space="preserve">16.7</w:t>
+            </w:r>
+          </w:p>
+        </w:tc>
+      </w:tr>
+      <w:tr>
+        <w:trPr>
+          <w:cantSplit/>
+          <w:tblHeader w:val="false"/>
+        </w:trPr>
+        <w:tc>
+          <w:tcPr>
+            <w:tcW w:type="dxa" w:w="2900"/>
+            <w:tcBorders>
+              <w:top w:val="single" w:color="BFBFBF" w:sz="4"/>
+              <w:left w:val="single" w:color="BFBFBF" w:sz="4"/>
+              <w:bottom w:val="single" w:color="BFBFBF" w:sz="4"/>
+              <w:right w:val="single" w:color="BFBFBF" w:sz="4"/>
+            </w:tcBorders>
+            <w:shd w:fill="F2F6FA" w:color="auto" w:val="clear"/>
+            <w:tcMar>
+              <w:top w:type="dxa" w:w="60"/>
+              <w:left w:type="dxa" w:w="100"/>
+              <w:bottom w:type="dxa" w:w="60"/>
+              <w:right w:type="dxa" w:w="100"/>
+            </w:tcMar>
+          </w:tcPr>
+          <w:p>
+            <w:pPr>
+              <w:spacing w:after="20"/>
+            </w:pPr>
+            <w:r>
+              <w:t xml:space="preserve">EfficientNetV2-B3 (exp004)</w:t>
+            </w:r>
+          </w:p>
+        </w:tc>
+        <w:tc>
+          <w:tcPr>
+            <w:tcW w:type="dxa" w:w="950"/>
+            <w:tcBorders>
+              <w:top w:val="single" w:color="BFBFBF" w:sz="4"/>
+              <w:left w:val="single" w:color="BFBFBF" w:sz="4"/>
+              <w:bottom w:val="single" w:color="BFBFBF" w:sz="4"/>
+              <w:right w:val="single" w:color="BFBFBF" w:sz="4"/>
+            </w:tcBorders>
+            <w:shd w:fill="F2F6FA" w:color="auto" w:val="clear"/>
+            <w:tcMar>
+              <w:top w:type="dxa" w:w="60"/>
+              <w:left w:type="dxa" w:w="100"/>
+              <w:bottom w:type="dxa" w:w="60"/>
+              <w:right w:type="dxa" w:w="100"/>
+            </w:tcMar>
+          </w:tcPr>
+          <w:p>
+            <w:pPr>
+              <w:spacing w:after="20"/>
+            </w:pPr>
+            <w:r>
+              <w:t xml:space="preserve">0.771</w:t>
+            </w:r>
+          </w:p>
+        </w:tc>
+        <w:tc>
+          <w:tcPr>
+            <w:tcW w:type="dxa" w:w="950"/>
+            <w:tcBorders>
+              <w:top w:val="single" w:color="BFBFBF" w:sz="4"/>
+              <w:left w:val="single" w:color="BFBFBF" w:sz="4"/>
+              <w:bottom w:val="single" w:color="BFBFBF" w:sz="4"/>
+              <w:right w:val="single" w:color="BFBFBF" w:sz="4"/>
+            </w:tcBorders>
+            <w:shd w:fill="F2F6FA" w:color="auto" w:val="clear"/>
+            <w:tcMar>
+              <w:top w:type="dxa" w:w="60"/>
+              <w:left w:type="dxa" w:w="100"/>
+              <w:bottom w:type="dxa" w:w="60"/>
+              <w:right w:type="dxa" w:w="100"/>
+            </w:tcMar>
+          </w:tcPr>
+          <w:p>
+            <w:pPr>
+              <w:spacing w:after="20"/>
+            </w:pPr>
+            <w:r>
+              <w:t xml:space="preserve">0.707</w:t>
+            </w:r>
+          </w:p>
+        </w:tc>
+        <w:tc>
+          <w:tcPr>
+            <w:tcW w:type="dxa" w:w="1000"/>
+            <w:tcBorders>
+              <w:top w:val="single" w:color="BFBFBF" w:sz="4"/>
+              <w:left w:val="single" w:color="BFBFBF" w:sz="4"/>
+              <w:bottom w:val="single" w:color="BFBFBF" w:sz="4"/>
+              <w:right w:val="single" w:color="BFBFBF" w:sz="4"/>
+            </w:tcBorders>
+            <w:shd w:fill="F2F6FA" w:color="auto" w:val="clear"/>
+            <w:tcMar>
+              <w:top w:type="dxa" w:w="60"/>
+              <w:left w:type="dxa" w:w="100"/>
+              <w:bottom w:type="dxa" w:w="60"/>
+              <w:right w:type="dxa" w:w="100"/>
+            </w:tcMar>
+          </w:tcPr>
+          <w:p>
+            <w:pPr>
+              <w:spacing w:after="20"/>
+            </w:pPr>
+            <w:r>
+              <w:t xml:space="preserve">−0.056</w:t>
+            </w:r>
+          </w:p>
+        </w:tc>
+        <w:tc>
+          <w:tcPr>
+            <w:tcW w:type="dxa" w:w="1000"/>
+            <w:tcBorders>
+              <w:top w:val="single" w:color="BFBFBF" w:sz="4"/>
+              <w:left w:val="single" w:color="BFBFBF" w:sz="4"/>
+              <w:bottom w:val="single" w:color="BFBFBF" w:sz="4"/>
+              <w:right w:val="single" w:color="BFBFBF" w:sz="4"/>
+            </w:tcBorders>
+            <w:shd w:fill="F2F6FA" w:color="auto" w:val="clear"/>
+            <w:tcMar>
+              <w:top w:type="dxa" w:w="60"/>
+              <w:left w:type="dxa" w:w="100"/>
+              <w:bottom w:type="dxa" w:w="60"/>
+              <w:right w:type="dxa" w:w="100"/>
+            </w:tcMar>
+          </w:tcPr>
+          <w:p>
+            <w:pPr>
+              <w:spacing w:after="20"/>
+            </w:pPr>
+            <w:r>
+              <w:t xml:space="preserve">−0.070</w:t>
+            </w:r>
+          </w:p>
+        </w:tc>
+        <w:tc>
+          <w:tcPr>
+            <w:tcW w:type="dxa" w:w="1300"/>
+            <w:tcBorders>
+              <w:top w:val="single" w:color="BFBFBF" w:sz="4"/>
+              <w:left w:val="single" w:color="BFBFBF" w:sz="4"/>
+              <w:bottom w:val="single" w:color="BFBFBF" w:sz="4"/>
+              <w:right w:val="single" w:color="BFBFBF" w:sz="4"/>
+            </w:tcBorders>
+            <w:shd w:fill="F2F6FA" w:color="auto" w:val="clear"/>
+            <w:tcMar>
+              <w:top w:type="dxa" w:w="60"/>
+              <w:left w:type="dxa" w:w="100"/>
+              <w:bottom w:type="dxa" w:w="60"/>
+              <w:right w:type="dxa" w:w="100"/>
+            </w:tcMar>
+          </w:tcPr>
+          <w:p>
+            <w:pPr>
+              <w:spacing w:after="20"/>
+            </w:pPr>
+            <w:r>
+              <w:t xml:space="preserve">129</w:t>
+            </w:r>
+          </w:p>
+        </w:tc>
+        <w:tc>
+          <w:tcPr>
+            <w:tcW w:type="dxa" w:w="1260"/>
+            <w:tcBorders>
+              <w:top w:val="single" w:color="BFBFBF" w:sz="4"/>
+              <w:left w:val="single" w:color="BFBFBF" w:sz="4"/>
+              <w:bottom w:val="single" w:color="BFBFBF" w:sz="4"/>
+              <w:right w:val="single" w:color="BFBFBF" w:sz="4"/>
+            </w:tcBorders>
+            <w:shd w:fill="F2F6FA" w:color="auto" w:val="clear"/>
+            <w:tcMar>
+              <w:top w:type="dxa" w:w="60"/>
+              <w:left w:type="dxa" w:w="100"/>
+              <w:bottom w:type="dxa" w:w="60"/>
+              <w:right w:type="dxa" w:w="100"/>
+            </w:tcMar>
+          </w:tcPr>
+          <w:p>
+            <w:pPr>
+              <w:spacing w:after="20"/>
+            </w:pPr>
+            <w:r>
+              <w:t xml:space="preserve">15.9</w:t>
+            </w:r>
+          </w:p>
+        </w:tc>
+      </w:tr>
+      <w:tr>
+        <w:trPr>
+          <w:cantSplit/>
+          <w:tblHeader w:val="false"/>
+        </w:trPr>
+        <w:tc>
+          <w:tcPr>
+            <w:tcW w:type="dxa" w:w="2900"/>
+            <w:tcBorders>
+              <w:top w:val="single" w:color="BFBFBF" w:sz="4"/>
+              <w:left w:val="single" w:color="BFBFBF" w:sz="4"/>
+              <w:bottom w:val="single" w:color="BFBFBF" w:sz="4"/>
+              <w:right w:val="single" w:color="BFBFBF" w:sz="4"/>
+            </w:tcBorders>
+            <w:tcMar>
+              <w:top w:type="dxa" w:w="60"/>
+              <w:left w:type="dxa" w:w="100"/>
+              <w:bottom w:type="dxa" w:w="60"/>
+              <w:right w:type="dxa" w:w="100"/>
+            </w:tcMar>
+          </w:tcPr>
+          <w:p>
+            <w:pPr>
+              <w:spacing w:after="20"/>
+            </w:pPr>
+            <w:r>
+              <w:t xml:space="preserve">MobileNetV4-M (exp003)</w:t>
+            </w:r>
+          </w:p>
+        </w:tc>
+        <w:tc>
+          <w:tcPr>
+            <w:tcW w:type="dxa" w:w="950"/>
+            <w:tcBorders>
+              <w:top w:val="single" w:color="BFBFBF" w:sz="4"/>
+              <w:left w:val="single" w:color="BFBFBF" w:sz="4"/>
+              <w:bottom w:val="single" w:color="BFBFBF" w:sz="4"/>
+              <w:right w:val="single" w:color="BFBFBF" w:sz="4"/>
+            </w:tcBorders>
+            <w:tcMar>
+              <w:top w:type="dxa" w:w="60"/>
+              <w:left w:type="dxa" w:w="100"/>
+              <w:bottom w:type="dxa" w:w="60"/>
+              <w:right w:type="dxa" w:w="100"/>
+            </w:tcMar>
+          </w:tcPr>
+          <w:p>
+            <w:pPr>
+              <w:spacing w:after="20"/>
+            </w:pPr>
+            <w:r>
+              <w:t xml:space="preserve">0.743</w:t>
+            </w:r>
+          </w:p>
+        </w:tc>
+        <w:tc>
+          <w:tcPr>
+            <w:tcW w:type="dxa" w:w="950"/>
+            <w:tcBorders>
+              <w:top w:val="single" w:color="BFBFBF" w:sz="4"/>
+              <w:left w:val="single" w:color="BFBFBF" w:sz="4"/>
+              <w:bottom w:val="single" w:color="BFBFBF" w:sz="4"/>
+              <w:right w:val="single" w:color="BFBFBF" w:sz="4"/>
+            </w:tcBorders>
+            <w:tcMar>
+              <w:top w:type="dxa" w:w="60"/>
+              <w:left w:type="dxa" w:w="100"/>
+              <w:bottom w:type="dxa" w:w="60"/>
+              <w:right w:type="dxa" w:w="100"/>
+            </w:tcMar>
+          </w:tcPr>
+          <w:p>
+            <w:pPr>
+              <w:spacing w:after="20"/>
+            </w:pPr>
+            <w:r>
+              <w:t xml:space="preserve">0.701</w:t>
+            </w:r>
+          </w:p>
+        </w:tc>
+        <w:tc>
+          <w:tcPr>
+            <w:tcW w:type="dxa" w:w="1000"/>
+            <w:tcBorders>
+              <w:top w:val="single" w:color="BFBFBF" w:sz="4"/>
+              <w:left w:val="single" w:color="BFBFBF" w:sz="4"/>
+              <w:bottom w:val="single" w:color="BFBFBF" w:sz="4"/>
+              <w:right w:val="single" w:color="BFBFBF" w:sz="4"/>
+            </w:tcBorders>
+            <w:tcMar>
+              <w:top w:type="dxa" w:w="60"/>
+              <w:left w:type="dxa" w:w="100"/>
+              <w:bottom w:type="dxa" w:w="60"/>
+              <w:right w:type="dxa" w:w="100"/>
+            </w:tcMar>
+          </w:tcPr>
+          <w:p>
+            <w:pPr>
+              <w:spacing w:after="20"/>
+            </w:pPr>
+            <w:r>
+              <w:t xml:space="preserve">−0.083</w:t>
+            </w:r>
+          </w:p>
+        </w:tc>
+        <w:tc>
+          <w:tcPr>
+            <w:tcW w:type="dxa" w:w="1000"/>
+            <w:tcBorders>
+              <w:top w:val="single" w:color="BFBFBF" w:sz="4"/>
+              <w:left w:val="single" w:color="BFBFBF" w:sz="4"/>
+              <w:bottom w:val="single" w:color="BFBFBF" w:sz="4"/>
+              <w:right w:val="single" w:color="BFBFBF" w:sz="4"/>
+            </w:tcBorders>
+            <w:tcMar>
+              <w:top w:type="dxa" w:w="60"/>
+              <w:left w:type="dxa" w:w="100"/>
+              <w:bottom w:type="dxa" w:w="60"/>
+              <w:right w:type="dxa" w:w="100"/>
+            </w:tcMar>
+          </w:tcPr>
+          <w:p>
+            <w:pPr>
+              <w:spacing w:after="20"/>
+            </w:pPr>
+            <w:r>
+              <w:t xml:space="preserve">−0.076</w:t>
+            </w:r>
+          </w:p>
+        </w:tc>
+        <w:tc>
+          <w:tcPr>
+            <w:tcW w:type="dxa" w:w="1300"/>
+            <w:tcBorders>
+              <w:top w:val="single" w:color="BFBFBF" w:sz="4"/>
+              <w:left w:val="single" w:color="BFBFBF" w:sz="4"/>
+              <w:bottom w:val="single" w:color="BFBFBF" w:sz="4"/>
+              <w:right w:val="single" w:color="BFBFBF" w:sz="4"/>
+            </w:tcBorders>
+            <w:tcMar>
+              <w:top w:type="dxa" w:w="60"/>
+              <w:left w:type="dxa" w:w="100"/>
+              <w:bottom w:type="dxa" w:w="60"/>
+              <w:right w:type="dxa" w:w="100"/>
+            </w:tcMar>
+          </w:tcPr>
+          <w:p>
+            <w:pPr>
+              <w:spacing w:after="20"/>
+            </w:pPr>
+            <w:r>
+              <w:t xml:space="preserve">66</w:t>
+            </w:r>
+          </w:p>
+        </w:tc>
+        <w:tc>
+          <w:tcPr>
+            <w:tcW w:type="dxa" w:w="1260"/>
+            <w:tcBorders>
+              <w:top w:val="single" w:color="BFBFBF" w:sz="4"/>
+              <w:left w:val="single" w:color="BFBFBF" w:sz="4"/>
+              <w:bottom w:val="single" w:color="BFBFBF" w:sz="4"/>
+              <w:right w:val="single" w:color="BFBFBF" w:sz="4"/>
+            </w:tcBorders>
+            <w:tcMar>
+              <w:top w:type="dxa" w:w="60"/>
+              <w:left w:type="dxa" w:w="100"/>
+              <w:bottom w:type="dxa" w:w="60"/>
+              <w:right w:type="dxa" w:w="100"/>
+            </w:tcMar>
+          </w:tcPr>
+          <w:p>
+            <w:pPr>
+              <w:spacing w:after="20"/>
+            </w:pPr>
+            <w:r>
+              <w:t xml:space="preserve">9.2</w:t>
+            </w:r>
+          </w:p>
+        </w:tc>
+      </w:tr>
+    </w:tbl>
+    <w:p>
+      <w:pPr>
+        <w:spacing w:after="100" w:before="60"/>
+      </w:pPr>
+      <w:r>
+        <w:rPr>
+          <w:i/>
+          <w:iCs/>
+          <w:color w:val="595959"/>
+          <w:sz w:val="18"/>
+          <w:szCs w:val="18"/>
+        </w:rPr>
+        <w:t xml:space="preserve">Δ contra exp002 en fold 0 (gold 0.776), no contra el gold de 5 folds (0.788). Costo medido en A100: GMACs y ms por estudio de 5 series × 16 cortes.</w:t>
+      </w:r>
+    </w:p>
+    <w:p>
+      <w:pPr>
+        <w:pStyle w:val="ListParagraph"/>
+        <w:numPr>
+          <w:ilvl w:val="0"/>
+          <w:numId w:val="2"/>
+        </w:numPr>
+        <w:spacing w:after="60"/>
+      </w:pPr>
+      <w:r>
+        <w:rPr>
+          <w:b/>
+          <w:bCs/>
+        </w:rPr>
+        <w:t xml:space="preserve">Conclusión</w:t>
+      </w:r>
+      <w:r>
+        <w:t xml:space="preserve">: con esta receta nada supera a DINOv2-S (5 folds: OOF pseudo 0.801, gold 0.788). El candidato barato es ConvNeXtV2-N: 196 contra 490 GMACs (−60 %) a cambio de −0.025 en pseudo.</w:t>
+      </w:r>
+    </w:p>
+    <w:p>
+      <w:pPr>
+        <w:pStyle w:val="ListParagraph"/>
+        <w:numPr>
+          <w:ilvl w:val="0"/>
+          <w:numId w:val="2"/>
+        </w:numPr>
+        <w:spacing w:after="60"/>
+      </w:pPr>
+      <w:r>
+        <w:rPr>
+          <w:b/>
+          <w:bCs/>
+        </w:rPr>
+        <w:t xml:space="preserve">GMACs no es tiempo</w:t>
+      </w:r>
+      <w:r>
+        <w:t xml:space="preserve">: ConvNeXtV2-N hace menos operaciones pero tarda más por estudio (24.7 contra 14.6 ms). Para la fórmula de Kaggle cuenta el reloj, así que hay que medir los dos.</w:t>
+      </w:r>
+    </w:p>
+    <w:p>
+      <w:pPr>
+        <w:pStyle w:val="ListParagraph"/>
+        <w:numPr>
+          <w:ilvl w:val="0"/>
+          <w:numId w:val="2"/>
+        </w:numPr>
+        <w:spacing w:after="60"/>
+      </w:pPr>
+      <w:r>
+        <w:rPr>
+          <w:b/>
+          <w:bCs/>
+        </w:rPr>
+        <w:t xml:space="preserve">La pseudo sirve para comparar modelos</w:t>
+      </w:r>
+      <w:r>
+        <w:t xml:space="preserve">: el orden por pseudo y por gold coincide exactamente en los 7. No sirve como número absoluto del paper (gold queda 0.03–0.06 por debajo).</w:t>
+      </w:r>
+    </w:p>
+    <w:p>
+      <w:pPr>
+        <w:pStyle w:val="ListParagraph"/>
+        <w:numPr>
+          <w:ilvl w:val="0"/>
+          <w:numId w:val="2"/>
+        </w:numPr>
+        <w:spacing w:after="60"/>
+      </w:pPr>
+      <w:r>
+        <w:t xml:space="preserve">Tres backbones caen más de 0.02 en gold contra el padre (DINOv3-S, EfficientNetV2-B3, MobileNetV4-M).</w:t>
+      </w:r>
+    </w:p>
+    <w:p>
+      <w:pPr>
+        <w:pStyle w:val="Heading2"/>
+        <w:spacing w:after="80" w:before="200"/>
+      </w:pPr>
+      <w:r>
+        <w:t xml:space="preserve">Infraestructura y preparación</w:t>
+      </w:r>
+    </w:p>
+    <w:p>
+      <w:pPr>
+        <w:pStyle w:val="ListParagraph"/>
+        <w:numPr>
+          <w:ilvl w:val="0"/>
+          <w:numId w:val="2"/>
+        </w:numPr>
+        <w:spacing w:after="60"/>
+      </w:pPr>
+      <w:r>
+        <w:t xml:space="preserve">Volumen migrado a EU-RO-1 y verificado.</w:t>
+      </w:r>
+    </w:p>
+    <w:p>
+      <w:pPr>
+        <w:pStyle w:val="ListParagraph"/>
+        <w:numPr>
+          <w:ilvl w:val="0"/>
+          <w:numId w:val="2"/>
+        </w:numPr>
+        <w:spacing w:after="60"/>
+      </w:pPr>
+      <w:r>
+        <w:rPr>
+          <w:b/>
+          <w:bCs/>
+        </w:rPr>
+        <w:t xml:space="preserve">exp009 (metadatos DICOM v2, worked parcial)</w:t>
+      </w:r>
+      <w:r>
+        <w:t xml:space="preserve">: solo cabeceras, 819,635 archivos en 34 min y 0 errores. Plano por orientación en 99.3 % de las series; lado de la rodilla en 98.6 % de los estudios con 97.0 % de acierto contra el informe. El slot 1 (sagital líquido con supresión grasa) llega a 94.3 %, bajo el 95 % pedido: un hospital alemán no hace esa secuencia.</w:t>
+      </w:r>
+    </w:p>
+    <w:p>
+      <w:pPr>
+        <w:pStyle w:val="ListParagraph"/>
+        <w:numPr>
+          <w:ilvl w:val="0"/>
+          <w:numId w:val="2"/>
+        </w:numPr>
+        <w:spacing w:after="60"/>
+      </w:pPr>
+      <w:r>
+        <w:rPr>
+          <w:b/>
+          <w:bCs/>
+        </w:rPr>
+        <w:t xml:space="preserve">Cache v2 construido</w:t>
+      </w:r>
+      <w:r>
+        <w:t xml:space="preserve">: 0.5 mm/px, ventana de 160 mm, espejado y recorte al leer; 20,790 series sin errores, 72 GB. Listo para el paso 4.</w:t>
+      </w:r>
+    </w:p>
     <w:p>
       <w:pPr>
         <w:spacing w:before="240"/>

</xml_diff>